<commit_message>
Analyze recommended buying hours from Vietnam price history
</commit_message>
<xml_diff>
--- a/docs/ADY201m_Tai_lieu_du_an.docx
+++ b/docs/ADY201m_Tai_lieu_du_an.docx
@@ -35,7 +35,7 @@
     </w:p>
     <w:p>
       <w:r>
-        <w:t>Tài liệu ghi nhận chức năng đã triển khai và các điều kiện vận hành thực tế. Phân tích giờ mua tốt nhất là hướng phát triển tiếp theo, chưa có trong phiên bản hiện tại.</w:t>
+        <w:t>Tài liệu ghi nhận chức năng đã triển khai và các điều kiện vận hành thực tế. Phiên bản hiện tại đã có phân tích giờ nên mua theo lịch sử, kèm mức độ đầy đủ của dữ liệu.</w:t>
       </w:r>
     </w:p>
     <w:p>
@@ -418,7 +418,7 @@
                 <w:b w:val="0"/>
                 <w:sz w:val="20"/>
               </w:rPr>
-              <w:t>Nơi mua rẻ hơn theo sản phẩm so sánh được</w:t>
+              <w:t>Nơi mua rẻ hơn và khung giờ giá tốt theo lịch sử</w:t>
             </w:r>
           </w:p>
         </w:tc>
@@ -1460,7 +1460,7 @@
     </w:p>
     <w:p>
       <w:r>
-        <w:t>npm test kiểm tra chuẩn hóa quan sát, chống trùng theo từng thời điểm, loại giá hoặc thời gian không hợp lệ, ghép 1 lít với 1.000 ml, giữ riêng quy cách chưa rõ và loại cặp có thời điểm lệch quá giới hạn. Hai kiểm thử hiện đều đạt.</w:t>
+        <w:t>npm test kiểm tra chuẩn hóa quan sát, chống trùng theo từng thời điểm, loại giá hoặc thời gian không hợp lệ, ghép 1 lít với 1.000 ml, giữ riêng quy cách chưa rõ và loại cặp có thời điểm lệch quá giới hạn. Các kiểm thử hiện đều đạt, gồm phân tích giờ Việt Nam, dữ liệu ít, ngày không chung và quy cách khác nhau.</w:t>
       </w:r>
     </w:p>
     <w:p>
@@ -1473,12 +1473,12 @@
         <w:pStyle w:val="Heading1"/>
       </w:pPr>
       <w:r>
-        <w:t>Hướng phát triển giờ mua tốt nhất</w:t>
+        <w:t>Phân tích khung giờ nên mua</w:t>
       </w:r>
     </w:p>
     <w:p>
       <w:r>
-        <w:t>Phiên bản hiện tại chưa gợi ý khung giờ mua tốt nhất. Để bổ sung, cần thu thập nhiều ngày, phân nhóm theo giờ Việt Nam cho cùng sản phẩm và siêu thị, so sánh giá trung bình hoặc trung vị, số ngày quan sát, mức giảm và độ ổn định. Khung giờ giá thấp theo lịch sử là tham khảo, không bảo đảm giá tương lai.</w:t>
+        <w:t>Hệ thống phân tích 30 ngày gần nhất, riêng từng sản phẩm, quy cách và siêu thị theo giờ Việt Nam. Mỗi ngày và giờ lấy giá trung vị, rồi xếp hạng giá tương đối trên các ngày chung. Khuyến nghị cần ít nhất hai giờ và ba ngày chung. Ít hơn thì chỉ tham khảo; giá gần bằng nhau thì không chọn giờ ưu tiên. Giờ chưa thu thập để trống, dữ liệu quá 48 giờ được đánh dấu cũ. Xem mục Giờ nào nên mua và hai báo cáo CSV buying_hour_summary, hourly_product_prices. Kết quả không bảo đảm giá tương lai.</w:t>
       </w:r>
     </w:p>
     <w:p>

</xml_diff>

<commit_message>
Migrate hourly price collection and analysis to Python and SQL Server
</commit_message>
<xml_diff>
--- a/docs/ADY201m_Tai_lieu_du_an.docx
+++ b/docs/ADY201m_Tai_lieu_du_an.docx
@@ -17,7 +17,7 @@
     </w:p>
     <w:p>
       <w:r>
-        <w:t>Cập nhật ngày 11 tháng 10 năm 2026</w:t>
+        <w:t>Cập nhật ngày 12 tháng 10 năm 2026</w:t>
       </w:r>
     </w:p>
     <w:p>
@@ -434,7 +434,7 @@
     </w:p>
     <w:p>
       <w:r>
-        <w:t>Báo cáo tại thời điểm lập tài liệu có 6,738 quan sát, trong đó 6,678 quan sát hợp lệ. Lần kiểm tra cào thực tế đã bổ sung 1.562 sản phẩm. Số sản phẩm ghép được có thể thay đổi khi thời điểm hoặc quy cách giá khác nhau.</w:t>
+        <w:t>Báo cáo tại thời điểm lập tài liệu có 45,844 quan sát, trong đó 45,785 quan sát hợp lệ. Chu kỳ kiểm tra Python đã bổ sung 50 quan sát WinMart. Số sản phẩm ghép được có thể thay đổi khi thời điểm hoặc quy cách giá khác nhau.</w:t>
       </w:r>
     </w:p>
     <w:p>
@@ -452,7 +452,7 @@
     </w:p>
     <w:p>
       <w:r>
-        <w:t>Windows Task Scheduler gọi src/pipeline.js. Chu kỳ phát hiện danh mục, chạy bộ cào Playwright, chuẩn hóa quan sát, lưu vào SQL Server, phân tích lịch sử rồi cập nhật dữ liệu cho giao diện web. Nếu sitemap lỗi, hệ thống dùng danh mục từ lịch sử SQL, bộ nhớ đệm hoặc cấu hình dự phòng.</w:t>
+        <w:t>Windows Task Scheduler gọi python -m ady pipeline. Chu kỳ phát hiện danh mục, chạy bộ cào Playwright Python và BeautifulSoup, chuẩn hóa quan sát, lưu vào SQL Server, phân tích lịch sử rồi cập nhật dữ liệu cho giao diện web. Nếu sitemap lỗi, hệ thống dùng danh mục từ lịch sử SQL, bộ nhớ đệm hoặc cấu hình dự phòng.</w:t>
       </w:r>
     </w:p>
     <w:p>
@@ -466,7 +466,7 @@
     </w:p>
     <w:p>
       <w:r>
-        <w:t>src/pipeline.js dùng file khóa để tránh hai chu kỳ chạy đồng thời. Chu kỳ không lấy được sản phẩm sẽ báo lỗi. Nếu một số danh mục lỗi, các danh mục thành công vẫn có thể được lưu; cần đọc log để đánh giá độ đầy đủ.</w:t>
+        <w:t>ady/__main__.py dùng file khóa để tránh hai chu kỳ chạy đồng thời. Chu kỳ không lấy được sản phẩm sẽ báo lỗi. Nếu một số danh mục lỗi, các danh mục thành công vẫn có thể được lưu; cần đọc log để đánh giá độ đầy đủ.</w:t>
       </w:r>
     </w:p>
     <w:p>
@@ -564,7 +564,7 @@
                 <w:b w:val="0"/>
                 <w:sz w:val="20"/>
               </w:rPr>
-              <w:t>Mã nguồn</w:t>
+              <w:t>Xử lý phía máy chủ</w:t>
             </w:r>
           </w:p>
         </w:tc>
@@ -589,7 +589,7 @@
                 <w:b w:val="0"/>
                 <w:sz w:val="20"/>
               </w:rPr>
-              <w:t>Node.js từ 24.15 và JavaScript ES modules</w:t>
+              <w:t>Python từ 3.12 và SQL</w:t>
             </w:r>
           </w:p>
         </w:tc>
@@ -641,7 +641,7 @@
                 <w:b w:val="0"/>
                 <w:sz w:val="20"/>
               </w:rPr>
-              <w:t>Playwright và Chromium</w:t>
+              <w:t>Playwright Python BeautifulSoup và Chromium</w:t>
             </w:r>
           </w:p>
         </w:tc>
@@ -1318,7 +1318,7 @@
     </w:p>
     <w:p>
       <w:r>
-        <w:t>Cài Node.js tương thích, SQL Server và sqlcmd ODBC. Đăng nhập Windows bằng tài khoản có quyền truy cập database. Clone repository rồi mở terminal trong thư mục dự án.</w:t>
+        <w:t>Cài Python từ 3.12, SQL Server và sqlcmd ODBC. Đăng nhập Windows bằng tài khoản có quyền truy cập database. Clone repository rồi mở terminal trong thư mục dự án.</w:t>
       </w:r>
     </w:p>
     <w:p>
@@ -1327,9 +1327,13 @@
           <w:rFonts w:ascii="Consolas" w:hAnsi="Consolas"/>
           <w:sz w:val="20"/>
         </w:rPr>
-        <w:t>npm ci</w:t>
+        <w:t>python -m venv .venv</w:t>
         <w:br/>
-        <w:t>npx playwright install chromium</w:t>
+        <w:t>.\.venv\Scripts\Activate.ps1</w:t>
+        <w:br/>
+        <w:t>pip install -r requirements.txt</w:t>
+        <w:br/>
+        <w:t>python -m playwright install chromium</w:t>
       </w:r>
     </w:p>
     <w:p>
@@ -1343,25 +1347,14 @@
           <w:rFonts w:ascii="Consolas" w:hAnsi="Consolas"/>
           <w:sz w:val="20"/>
         </w:rPr>
-        <w:t>npm run pipeline</w:t>
+        <w:t>python -m ady pipeline</w:t>
         <w:br/>
-        <w:t>npm start</w:t>
+        <w:t>python -m ady serve</w:t>
       </w:r>
     </w:p>
     <w:p>
       <w:r>
-        <w:t>pipeline thực hiện một chu kỳ đầy đủ. npm start phục vụ giao diện mặc định tại http://localhost:4173/analytics.html. Máy hiện tại đang dùng cổng 4174; có thể đặt PORT để đổi cổng.</w:t>
-      </w:r>
-    </w:p>
-    <w:p>
-      <w:r>
-        <w:rPr>
-          <w:rFonts w:ascii="Consolas" w:hAnsi="Consolas"/>
-          <w:sz w:val="20"/>
-        </w:rPr>
-        <w:t>$env:PORT='4174'</w:t>
-        <w:br/>
-        <w:t>npm start</w:t>
+        <w:t>pipeline thực hiện một chu kỳ đầy đủ. serve phục vụ giao diện tại http://localhost:4174/analytics.html. Có thể dùng --port để đổi cổng. Không cần Node.js để chạy dự án.</w:t>
       </w:r>
     </w:p>
     <w:p>
@@ -1374,12 +1367,12 @@
     </w:p>
     <w:p>
       <w:r>
-        <w:t>Máy hiện tại đã có tác vụ ADY201m-Hourly-Prices. Tác vụ chạy Node trực tiếp với src/pipeline.js trong thư mục dự án, mỗi giờ, theo tài khoản Windows đăng nhập. Cần máy bật, có mạng và SQL Server hoạt động. Tác vụ này nằm trong Windows và không tự đi theo repository khi clone sang máy khác.</w:t>
+        <w:t>Tác vụ ADY201m-Hourly-Prices chạy Python trong .venv với -m ady pipeline mỗi giờ theo tài khoản Windows đăng nhập. Cần máy bật, có mạng và SQL Server hoạt động. Lịch không tự đi theo repository khi clone sang máy khác.</w:t>
       </w:r>
     </w:p>
     <w:p>
       <w:r>
-        <w:t>Trên máy khác, tạo tác vụ tương tự với đường dẫn Node và thư mục dự án của máy đó; đặt Multiple instances thành Ignore new instance. Hoặc dùng lệnh sau để chạy một tiến trình theo dõi liên tục, thu thập ngay rồi lặp mỗi 60 phút.</w:t>
+        <w:t>Chạy scripts/install-hourly.ps1 sau khi cài môi trường để tạo lịch trên máy khác. Script đặt IgnoreNew tránh chạy chồng. Hoặc dùng watch để thu thập ngay rồi lặp mỗi 60 phút.</w:t>
       </w:r>
     </w:p>
     <w:p>
@@ -1388,12 +1381,14 @@
           <w:rFonts w:ascii="Consolas" w:hAnsi="Consolas"/>
           <w:sz w:val="20"/>
         </w:rPr>
-        <w:t>npm run scrape:watch</w:t>
+        <w:t>.\scripts\install-hourly.ps1</w:t>
+        <w:br/>
+        <w:t>python -m ady watch</w:t>
       </w:r>
     </w:p>
     <w:p>
       <w:r>
-        <w:t>Chỉ dùng một cơ chế lịch trên cùng một máy. Xem logs/scrape.log để kiểm tra chu kỳ; scripts/hourly.ps1 là lựa chọn chạy thủ công và cần sửa đường dẫn nếu chuyển máy.</w:t>
+        <w:t>Chỉ dùng một cơ chế lịch trên cùng một máy. Xem logs/scrape.log để kiểm tra chu kỳ. scripts/hourly.ps1 chạy thủ công bằng Python trong .venv.</w:t>
       </w:r>
     </w:p>
     <w:p>
@@ -1460,12 +1455,12 @@
     </w:p>
     <w:p>
       <w:r>
-        <w:t>npm test kiểm tra chuẩn hóa quan sát, chống trùng theo từng thời điểm, loại giá hoặc thời gian không hợp lệ, ghép 1 lít với 1.000 ml, giữ riêng quy cách chưa rõ và loại cặp có thời điểm lệch quá giới hạn. Các kiểm thử hiện đều đạt, gồm phân tích giờ Việt Nam, dữ liệu ít, ngày không chung và quy cách khác nhau.</w:t>
+        <w:t>python -m unittest discover -s tests chạy 8 kiểm thử Python cho khóa SHA256 tương thích, loại giá hoặc thời gian không hợp lệ, ghép 1 lít với 1.000 ml, giữ riêng quy cách chưa rõ, giới hạn thời gian, phân tích giờ Việt Nam và trích xuất HTML cùng JSON-LD. Các kiểm thử đều đạt.</w:t>
       </w:r>
     </w:p>
     <w:p>
       <w:r>
-        <w:t>Việc chuyển dữ liệu cũ sang SQL Server đã đối chiếu đủ 6.738 bản ghi. Nhập lại cùng dữ liệu không tạo bản ghi mới. Báo cáo và danh mục đã chạy thành công từ SQL Server; kiểm tra thực tế giữ nguyên tên tiếng Việt.</w:t>
+        <w:t>Python đã đọc được toàn bộ lịch sử SQL hiện tại và chạy một chu kỳ cào WinMart, lưu SQL, tạo báo cáo và danh mục. Cấu trúc bảng và khóa chống trùng giữ tương thích với lịch sử trước chuyển đổi.</w:t>
       </w:r>
     </w:p>
     <w:p>

</xml_diff>